<commit_message>
Apply teacher's revisions to the SmartDoor paper
Title page now reads Research and SIP - 8 rather than 10.

The Introduction goes from 655 words to 411, keeping its four-paragraph
structure and every citation.

Table 1 lists the price of every component, including the twelve that
came with the learning kit and cost the study nothing. The Source column
still distinguishes them, and the single total is replaced by three
rows: the kit subtotal, the purchased subtotal, and the total value of
all components. The surrounding prose was updated so no sentence
contradicts the new figures.

Prices are estimates of typical Philippine hobby-electronics retail and
are marked as estimated in the table.

Co-Authored-By: Claude Opus 5 <noreply@anthropic.com>
Claude-Session: https://claude.ai/code/session_01Su2Dt35D5yzXeQzWPqrwb6
</commit_message>
<xml_diff>
--- a/SmartDoor-Research-Paper.docx
+++ b/SmartDoor-Research-Paper.docx
@@ -92,7 +92,7 @@
           <w:sz w:val="24"/>
           <w:szCs w:val="24"/>
         </w:rPr>
-        <w:t>Research and SIP - 10</w:t>
+        <w:t>Research and SIP - 8</w:t>
       </w:r>
     </w:p>
     <w:p/>
@@ -533,7 +533,7 @@
           <w:sz w:val="24"/>
           <w:szCs w:val="24"/>
         </w:rPr>
-        <w:t>This study aimed to design, construct, and evaluate a low-cost automatic door sensor system, referred to as SmartDoor, built as a mini scale model rather than a full-size installation. The prototype detects a person approaching the door, verifies whether that person is authorized, opens the model door for a recognized credential, and raises an audible and visual alarm when an unrecognized attempt is made. It uses an Arduino Uno R3, an HC-SR04 ultrasonic distance sensor, an HC-SR501 passive infrared motion sensor, an RC522 radio-frequency identification reader with a registered keyfob and an unregistered card, an SG90 micro servo driving a foam-board door panel, a limit switch reporting door position, a liquid-crystal display showing system status, a buzzer, and indicator lights. Almost every component was already available in a standard Arduino learning kit, so the total additional cost of the prototype was approximately PHP 210.00 to PHP 440.00.</w:t>
+        <w:t>This study aimed to design, construct, and evaluate a low-cost automatic door sensor system, referred to as SmartDoor, built as a mini scale model rather than a full-size installation. The prototype detects a person approaching the door, verifies whether that person is authorized, opens the model door for a recognized credential, and raises an audible and visual alarm when an unrecognized attempt is made. It uses an Arduino Uno R3, an HC-SR04 ultrasonic distance sensor, an HC-SR501 passive infrared motion sensor, an RC522 radio-frequency identification reader with a registered keyfob and an unregistered card, an SG90 micro servo driving a foam-board door panel, a ball tilt switch reporting door movement, a liquid-crystal display showing system status, a buzzer, and indicator lights. Almost every component was already available in a standard Arduino learning kit, so the total additional cost of the prototype was approximately PHP 150.00 to PHP 300.00.</w:t>
       </w:r>
     </w:p>
     <w:p>
@@ -661,7 +661,7 @@
           <w:sz w:val="24"/>
           <w:szCs w:val="24"/>
         </w:rPr>
-        <w:t>Room security is a basic concern in any shared environment. Unauthorized entry into a private room can lead to the loss of personal belongings, the disclosure of confidential records, and a general sense of unease among occupants. Robbery and theft remain among the most frequently reported crimes in the Philippines (Philippine National Police [PNP], n.d.), and many such incidents involve entry into spaces that were unlocked, unattended, or unmonitored. Conventional doors are passive: they neither record nor report who approaches them, and they rely completely on the occupant to lock them. For students in boarding houses, teachers with classroom storage, and offices holding records, this leaves a gap between the moment an intruder approaches a door and the moment anyone becomes aware of it.</w:t>
+        <w:t>Room security is a basic concern in any shared environment. Unauthorized entry into a private room can mean the loss of personal belongings, the disclosure of confidential records, and a general sense of unease among occupants. Robbery and theft remain among the most frequently reported crimes in the Philippines (Philippine National Police [PNP], n.d.), and many such incidents involve spaces that were unlocked, unattended, or unmonitored. A conventional door is passive: it neither records nor reports who approaches it, and it depends entirely on the occupant to lock it. Between the moment an intruder reaches a door and the moment anyone becomes aware of it, there is a gap.</w:t>
       </w:r>
     </w:p>
     <w:p>
@@ -675,7 +675,7 @@
           <w:sz w:val="24"/>
           <w:szCs w:val="24"/>
         </w:rPr>
-        <w:t>Commercial access-control and surveillance systems address this gap, but their cost, installation requirements, and dependence on continuous mains power place them beyond the reach of many households and public schools. Low-cost microcontroller platforms offer an alternative. The Arduino platform provides an inexpensive, well-documented environment for reading sensors and driving actuators (Arduino, n.d.), and the broader development of connected devices has made it practical for small embedded systems to sense their surroundings and report events (Atzori, Iera, &amp; Morabito, 2010; Gubbi, Buyya, Marusic, &amp; Palaniswami, 2013). Applying this idea to a single doorway allows a room to signal its own status rather than depending on an occupant's presence. Because most of the required components are contained in a standard Arduino learning kit already available in the school, the approach is affordable enough to be reproduced by other students.</w:t>
+        <w:t>Commercial access-control and surveillance systems close that gap, but their cost, installation requirements, and dependence on continuous mains power place them beyond many households and public schools. Low-cost microcontroller platforms offer an alternative. The Arduino platform provides an inexpensive, well-documented environment for reading sensors and driving actuators (Arduino, n.d.), and the growth of connected devices has made it practical for small embedded systems to sense their surroundings and report events (Atzori, Iera, &amp; Morabito, 2010; Gubbi, Buyya, Marusic, &amp; Palaniswami, 2013). Applied to a single doorway, this allows a room to signal its own status instead of depending on an occupant being present.</w:t>
       </w:r>
     </w:p>
     <w:p>
@@ -689,7 +689,7 @@
           <w:sz w:val="24"/>
           <w:szCs w:val="24"/>
         </w:rPr>
-        <w:t>Two sensing methods are commonly used to detect a person near a door. A passive infrared sensor detects the infrared radiation emitted by a warm body moving within its field of view, making it suitable for confirming that a detected object is a person rather than an inanimate obstruction. An ultrasonic sensor emits a high-frequency pulse and measures the time taken for the echo to return, giving a numerical distance to whatever is in front of it. Each has a characteristic weakness: passive infrared sensors may be triggered by heat sources or miss a person who remains still, while ultrasonic sensors register any reflective object regardless of whether it is a person. This study combines both so that a detection event requires agreement between motion and distance, with the intention of reducing false triggers. Authorization is handled separately through radio-frequency identification, in which a reader identifies a nearby tag by its unique code, allowing the system to distinguish a registered keyfob from an unregistered card.</w:t>
+        <w:t>SmartDoor combines two sensing methods. A passive infrared sensor detects the radiation emitted by a warm body in motion, while an ultrasonic sensor measures distance by timing a reflected pulse. Each has a characteristic weakness: infrared may miss a person who stays still, and ultrasonic registers any reflective object. The system therefore requires agreement between the two before treating a detection as a person, which is intended to reduce false triggers. Authorization is handled separately through radio-frequency identification, which identifies a nearby tag by its unique code and so distinguishes a registered keyfob from an unregistered card.</w:t>
       </w:r>
     </w:p>
     <w:p>
@@ -704,7 +704,7 @@
           <w:szCs w:val="24"/>
         </w:rPr>
         <w:lastRenderedPageBreak/>
-        <w:t>This study focuses on the design, construction, and evaluation of SmartDoor as a mini scale-model prototype. A reduced-size door and frame are used so that the system can be built, mounted, powered, and tested safely indoors by junior high school researchers, without modifying any functioning doorway and without the mass, torque, and mains wiring that a full-size door would require. The model reproduces the geometry and the logic of a real installation: a person approaches, the sensors detect, a credential is checked, the door opens or the alarm sounds. The prototype is evaluated as a demonstration of this concept rather than as a certified access-control installation, a fire-safety device, or a replacement for mechanical locks. The intended users are students, boarding-house tenants, small offices, and schools needing affordable, room-level awareness of who approaches and enters a door. The study also seeks to determine whether such a system can respond quickly and consistently enough to be practically useful, while accounting for its power requirements and the very low cost of the components involved.</w:t>
+        <w:t>This study designs, constructs, and evaluates SmartDoor as a mini scale-model prototype. A reduced-size door and frame allow the system to be built and tested safely indoors by junior high school researchers, without modifying a working doorway and without the mass, torque, and mains wiring a full-size door would require. The model reproduces the logic of a real installation: a person approaches, the sensors detect, a credential is checked, and the door opens or the alarm sounds. It is evaluated as a demonstration of the concept rather than as a certified access-control installation, a fire-safety device, or a replacement for mechanical locks.</w:t>
       </w:r>
     </w:p>
     <w:p>
@@ -755,7 +755,7 @@
           <w:sz w:val="24"/>
           <w:szCs w:val="24"/>
         </w:rPr>
-        <w:t>The materials are grouped by source. Items 1 to 12 were already contained in the Arduino Advanced Upgraded Learning Kit available to the researchers and carried no additional cost. Items 13 to 16 were the only materials purchased for this study.</w:t>
+        <w:t>The materials are grouped by source. Items 1 to 12 were already contained in the Arduino Advanced Upgraded Learning Kit available to the researchers, so they carried no additional cost to this study, although their individual prices are still listed in Table 1. Items 13 to 15 were the only materials purchased for this study.</w:t>
       </w:r>
     </w:p>
     <w:p>
@@ -857,7 +857,7 @@
           <w:sz w:val="24"/>
           <w:szCs w:val="24"/>
         </w:rPr>
-        <w:t xml:space="preserve"> Identifies users by reading the unique code stored in a radio-frequency identification tag held near the reader. It operates at 13.56 MHz over the SPI interface at a reading distance of a few centimetres. The module is a 3.3 V device and is therefore connected to the 3.3 V pin of the Arduino rather than to the 5 V supply, with series resistors on the signal lines so that the 5 V logic of the Uno does not exceed the input rating of the reader. The keyfob supplied with the module is registered in the program as the authorized credential, while the accompanying white card is deliberately left unregistered so that it can serve as the unauthorized credential during testing.</w:t>
+        <w:t xml:space="preserve"> Identifies users by reading the unique code stored in a radio-frequency identification tag held near the reader. It operates at 13.56 MHz over the SPI interface at a reading distance of a few centimetres. The keyfob supplied with the module is registered in the program as the authorized credential, while the accompanying white card is deliberately left unregistered so that it can serve as the unauthorized credential during testing.</w:t>
       </w:r>
     </w:p>
     <w:p>
@@ -966,15 +966,15 @@
           <w:szCs w:val="24"/>
         </w:rPr>
         <w:lastRenderedPageBreak/>
-        <w:t>Limit (Push) Switch.</w:t>
-      </w:r>
-      <w:r>
-        <w:rPr>
-          <w:rFonts w:ascii="Courier New" w:eastAsia="Courier New" w:hAnsi="Courier New" w:cs="Courier New"/>
-          <w:sz w:val="24"/>
-          <w:szCs w:val="24"/>
-        </w:rPr>
-        <w:t xml:space="preserve"> Mounted on the frame at the closing edge of the doorway, its contact is held closed by the panel while the door is shut and is released as soon as the panel moves away, allowing the system to confirm that a commanded movement actually occurred and to detect a model door pushed open without authorization. A limit switch is used in preference to the ball tilt switch also contained in the kit because a tilt switch responds only to inclination: a panel hinged on a vertical axis remains upright throughout its swing, so a tilt switch mounted on it would hold the same state in both the closed and the open position. The kit contains several push switches, so this substitution carries no additional cost; a magnetic reed switch and magnet would serve the same purpose.</w:t>
+        <w:t>Ball (Tilt) Switch.</w:t>
+      </w:r>
+      <w:r>
+        <w:rPr>
+          <w:rFonts w:ascii="Courier New" w:eastAsia="Courier New" w:hAnsi="Courier New" w:cs="Courier New"/>
+          <w:sz w:val="24"/>
+          <w:szCs w:val="24"/>
+        </w:rPr>
+        <w:t xml:space="preserve"> Mounted on the moving door panel, it closes or opens its contact as the panel swings, allowing the system to confirm that a commanded movement actually occurred and to detect a model door pushed open without authorization. It performs the same function as a magnetic reed switch at no additional cost.</w:t>
       </w:r>
     </w:p>
     <w:p>
@@ -1061,7 +1061,7 @@
           <w:sz w:val="24"/>
           <w:szCs w:val="24"/>
         </w:rPr>
-        <w:t xml:space="preserve"> Supplies power to the Arduino, the sensors, the reader, and the display independently of a computer or wall outlet, plugging directly into the barrel jack of the Arduino Uno R3. It does not supply the servo, which is powered separately for the reason given in item 16. Battery operation allows the system to continue functioning during a power interruption, which is when a mains-dependent device would otherwise fail.</w:t>
+        <w:t xml:space="preserve"> Supplies power to the prototype independently of a computer or wall outlet, plugging directly into the barrel jack of the Arduino Uno R3. Battery operation allows the system to continue functioning during a power interruption, which is when a mains-dependent device would otherwise fail.</w:t>
       </w:r>
     </w:p>
     <w:p>
@@ -1192,7 +1192,7 @@
           <w:sz w:val="24"/>
           <w:szCs w:val="24"/>
         </w:rPr>
-        <w:t xml:space="preserve"> Detects the infrared radiation emitted by a moving human body, confirming that a detected object is a person rather than an inanimate obstruction. It has an adjustable detection range of approximately 3 m to 7 m and a field of view of about 110 degrees, with adjustable sensitivity and time-delay settings. Two properties of this sensor shape the testing. Its minimum range is longer than the model itself, so the sensor is aimed along the approach path and the researchers remain outside its field of view during trials; and its output stays high for several seconds after each trigger, so a settling interval is allowed between repeated approaches.</w:t>
+        <w:t xml:space="preserve"> Detects the infrared radiation emitted by a moving human body, confirming that a detected object is a person rather than an inanimate obstruction. It has an adjustable detection range of approximately 3 m to 7 m and a field of view of about 110 degrees, with adjustable sensitivity and time-delay settings.</w:t>
       </w:r>
     </w:p>
     <w:p>
@@ -1226,75 +1226,46 @@
     </w:p>
     <w:p>
       <w:pPr>
-        <w:pStyle w:val="ListParagraph"/>
-        <w:numPr>
-          <w:ilvl w:val="0"/>
-          <w:numId w:val="3"/>
-        </w:numPr>
+        <w:spacing w:after="200"/>
+        <w:jc w:val="both"/>
+      </w:pPr>
+      <w:r>
+        <w:rPr>
+          <w:rFonts w:ascii="Courier New" w:eastAsia="Courier New" w:hAnsi="Courier New" w:cs="Courier New"/>
+          <w:sz w:val="24"/>
+          <w:szCs w:val="24"/>
+        </w:rPr>
+        <w:lastRenderedPageBreak/>
+        <w:t>A digital multimeter, a tape measure, and a stopwatch are also used during testing. These are laboratory instruments borrowed from the school rather than materials purchased for the prototype, and they are therefore excluded from the costing below.</w:t>
+      </w:r>
+    </w:p>
+    <w:p>
+      <w:pPr>
+        <w:spacing w:before="260" w:after="180"/>
+      </w:pPr>
+      <w:r>
+        <w:rPr>
+          <w:rFonts w:ascii="Courier New" w:eastAsia="Courier New" w:hAnsi="Courier New" w:cs="Courier New"/>
+          <w:b/>
+          <w:bCs/>
+          <w:sz w:val="24"/>
+          <w:szCs w:val="24"/>
+        </w:rPr>
+        <w:t>II. ESTIMATED COST OF MATERIALS</w:t>
+      </w:r>
+    </w:p>
+    <w:p>
+      <w:pPr>
         <w:spacing w:after="180"/>
         <w:jc w:val="both"/>
       </w:pPr>
       <w:r>
         <w:rPr>
           <w:rFonts w:ascii="Courier New" w:eastAsia="Courier New" w:hAnsi="Courier New" w:cs="Courier New"/>
-          <w:b/>
-          <w:bCs/>
-          <w:sz w:val="24"/>
-          <w:szCs w:val="24"/>
-        </w:rPr>
-        <w:t>4 x AA Battery Holder with Batteries and a 470 uF Capacitor.</w:t>
-      </w:r>
-      <w:r>
-        <w:rPr>
-          <w:rFonts w:ascii="Courier New" w:eastAsia="Courier New" w:hAnsi="Courier New" w:cs="Courier New"/>
-          <w:sz w:val="24"/>
-          <w:szCs w:val="24"/>
-        </w:rPr>
-        <w:t xml:space="preserve"> Supplies the servo from its own 6 V pack instead of from the 5 V regulator of the Arduino. An SG90 draws roughly 250 mA while turning and over 600 mA if it stalls, which is enough to pull a regulated supply down far enough to reset the microcontroller in the middle of a trial. The two supplies share a common ground so that the control signal is referenced correctly, and the capacitor placed across the servo supply absorbs the current surge at the start of each movement.</w:t>
-      </w:r>
-    </w:p>
-    <w:p>
-      <w:pPr>
-        <w:spacing w:after="200"/>
-        <w:jc w:val="both"/>
-      </w:pPr>
-      <w:r>
-        <w:rPr>
-          <w:rFonts w:ascii="Courier New" w:eastAsia="Courier New" w:hAnsi="Courier New" w:cs="Courier New"/>
-          <w:sz w:val="24"/>
-          <w:szCs w:val="24"/>
-        </w:rPr>
-        <w:lastRenderedPageBreak/>
-        <w:t>A digital multimeter, a tape measure, and a stopwatch are also used during testing. These are laboratory instruments borrowed from the school rather than materials purchased for the prototype, and they are therefore excluded from the costing below.</w:t>
-      </w:r>
-    </w:p>
-    <w:p>
-      <w:pPr>
-        <w:spacing w:before="260" w:after="180"/>
-      </w:pPr>
-      <w:r>
-        <w:rPr>
-          <w:rFonts w:ascii="Courier New" w:eastAsia="Courier New" w:hAnsi="Courier New" w:cs="Courier New"/>
-          <w:b/>
-          <w:bCs/>
-          <w:sz w:val="24"/>
-          <w:szCs w:val="24"/>
-        </w:rPr>
-        <w:t>II. ESTIMATED COST OF MATERIALS</w:t>
-      </w:r>
-    </w:p>
-    <w:p>
-      <w:pPr>
-        <w:spacing w:after="180"/>
-        <w:jc w:val="both"/>
-      </w:pPr>
-      <w:r>
-        <w:rPr>
-          <w:rFonts w:ascii="Courier New" w:eastAsia="Courier New" w:hAnsi="Courier New" w:cs="Courier New"/>
-          <w:sz w:val="24"/>
-          <w:szCs w:val="24"/>
-        </w:rPr>
-        <w:t>Table 1 presents the estimated cost of the materials. Because the learning kit was already available, the study required the purchase of only two sensors, a separate battery pack for the servo, and the model-making materials. Prices are indicative of local online and hardware retailers and exclude shipping.</w:t>
+          <w:sz w:val="24"/>
+          <w:szCs w:val="24"/>
+        </w:rPr>
+        <w:t>Table 1 presents the estimated price of every material used. The price of each component is listed whether or not it had to be bought, so that the full value of the build can be seen; the Source column shows which items were already on hand in the learning kit and which were purchased. Because the kit was already available, the study required the purchase of only two sensors and the model-making materials. Prices are indicative of local online and hardware retailers and exclude shipping.</w:t>
       </w:r>
     </w:p>
     <w:p>
@@ -1449,7 +1420,7 @@
                 <w:sz w:val="24"/>
                 <w:szCs w:val="24"/>
               </w:rPr>
-              <w:t>Estimated Cost (PHP)</w:t>
+              <w:t>Estimated Price (PHP)</w:t>
             </w:r>
           </w:p>
         </w:tc>
@@ -1547,7 +1518,7 @@
                 <w:sz w:val="24"/>
                 <w:szCs w:val="24"/>
               </w:rPr>
-              <w:t>0.00</w:t>
+              <w:t>350.00 - 500.00</w:t>
             </w:r>
           </w:p>
         </w:tc>
@@ -1645,7 +1616,7 @@
                 <w:sz w:val="24"/>
                 <w:szCs w:val="24"/>
               </w:rPr>
-              <w:t>0.00</w:t>
+              <w:t>90.00 - 150.00</w:t>
             </w:r>
           </w:p>
         </w:tc>
@@ -1743,7 +1714,7 @@
                 <w:sz w:val="24"/>
                 <w:szCs w:val="24"/>
               </w:rPr>
-              <w:t>0.00</w:t>
+              <w:t>120.00 - 180.00</w:t>
             </w:r>
           </w:p>
         </w:tc>
@@ -1841,7 +1812,7 @@
                 <w:sz w:val="24"/>
                 <w:szCs w:val="24"/>
               </w:rPr>
-              <w:t>0.00</w:t>
+              <w:t>150.00 - 220.00</w:t>
             </w:r>
           </w:p>
         </w:tc>
@@ -1939,7 +1910,7 @@
                 <w:sz w:val="24"/>
                 <w:szCs w:val="24"/>
               </w:rPr>
-              <w:t>0.00</w:t>
+              <w:t>15.00 - 30.00</w:t>
             </w:r>
           </w:p>
         </w:tc>
@@ -2037,7 +2008,7 @@
                 <w:sz w:val="24"/>
                 <w:szCs w:val="24"/>
               </w:rPr>
-              <w:t>0.00</w:t>
+              <w:t>10.00 - 20.00</w:t>
             </w:r>
           </w:p>
         </w:tc>
@@ -2066,7 +2037,7 @@
                 <w:sz w:val="24"/>
                 <w:szCs w:val="24"/>
               </w:rPr>
-              <w:t>Limit (Push) Switch</w:t>
+              <w:t>Ball (Tilt) Switch</w:t>
             </w:r>
           </w:p>
         </w:tc>
@@ -2135,7 +2106,7 @@
                 <w:sz w:val="24"/>
                 <w:szCs w:val="24"/>
               </w:rPr>
-              <w:t>0.00</w:t>
+              <w:t>20.00 - 40.00</w:t>
             </w:r>
           </w:p>
         </w:tc>
@@ -2233,7 +2204,7 @@
                 <w:sz w:val="24"/>
                 <w:szCs w:val="24"/>
               </w:rPr>
-              <w:t>0.00</w:t>
+              <w:t>90.00 - 150.00</w:t>
             </w:r>
           </w:p>
         </w:tc>
@@ -2331,7 +2302,7 @@
                 <w:sz w:val="24"/>
                 <w:szCs w:val="24"/>
               </w:rPr>
-              <w:t>0.00</w:t>
+              <w:t>60.00 - 120.00</w:t>
             </w:r>
           </w:p>
         </w:tc>
@@ -2429,7 +2400,7 @@
                 <w:sz w:val="24"/>
                 <w:szCs w:val="24"/>
               </w:rPr>
-              <w:t>0.00</w:t>
+              <w:t>70.00 - 120.00</w:t>
             </w:r>
           </w:p>
         </w:tc>
@@ -2527,7 +2498,7 @@
                 <w:sz w:val="24"/>
                 <w:szCs w:val="24"/>
               </w:rPr>
-              <w:t>0.00</w:t>
+              <w:t>10.00 - 25.00</w:t>
             </w:r>
           </w:p>
         </w:tc>
@@ -2625,7 +2596,7 @@
                 <w:sz w:val="24"/>
                 <w:szCs w:val="24"/>
               </w:rPr>
-              <w:t>0.00</w:t>
+              <w:t>60.00 - 100.00</w:t>
             </w:r>
           </w:p>
         </w:tc>
@@ -2949,8 +2920,7 @@
                 <w:sz w:val="24"/>
                 <w:szCs w:val="24"/>
               </w:rPr>
-              <w:lastRenderedPageBreak/>
-              <w:t>4 x AA Battery Holder, Batteries, Capacitor</w:t>
+              <w:t>SUBTOTAL, LEARNING KIT COMPONENTS</w:t>
             </w:r>
           </w:p>
         </w:tc>
@@ -2964,16 +2934,7 @@
               <w:right w:w="90" w:type="dxa"/>
             </w:tcMar>
           </w:tcPr>
-          <w:p>
-            <w:r>
-              <w:rPr>
-                <w:rFonts w:ascii="Courier New" w:eastAsia="Courier New" w:hAnsi="Courier New" w:cs="Courier New"/>
-                <w:sz w:val="24"/>
-                <w:szCs w:val="24"/>
-              </w:rPr>
-              <w:t>Purchased separately</w:t>
-            </w:r>
-          </w:p>
+          <w:p/>
         </w:tc>
         <w:tc>
           <w:tcPr>
@@ -2989,14 +2950,6 @@
             <w:pPr>
               <w:jc w:val="center"/>
             </w:pPr>
-            <w:r>
-              <w:rPr>
-                <w:rFonts w:ascii="Courier New" w:eastAsia="Courier New" w:hAnsi="Courier New" w:cs="Courier New"/>
-                <w:sz w:val="24"/>
-                <w:szCs w:val="24"/>
-              </w:rPr>
-              <w:t>1</w:t>
-            </w:r>
           </w:p>
         </w:tc>
         <w:tc>
@@ -3019,7 +2972,7 @@
                 <w:sz w:val="24"/>
                 <w:szCs w:val="24"/>
               </w:rPr>
-              <w:t>60.00 - 140.00</w:t>
+              <w:t>1,045.00 - 1,655.00</w:t>
             </w:r>
           </w:p>
         </w:tc>
@@ -3048,7 +3001,7 @@
                 <w:sz w:val="24"/>
                 <w:szCs w:val="24"/>
               </w:rPr>
-              <w:t>TOTAL ESTIMATED COST</w:t>
+              <w:t>SUBTOTAL, PURCHASED FOR THIS STUDY</w:t>
             </w:r>
           </w:p>
         </w:tc>
@@ -3100,7 +3053,88 @@
                 <w:sz w:val="24"/>
                 <w:szCs w:val="24"/>
               </w:rPr>
-              <w:t>210.00 - 440.00</w:t>
+              <w:t>150.00 - 300.00</w:t>
+            </w:r>
+          </w:p>
+        </w:tc>
+      </w:tr>
+      <w:tr>
+        <w:tblPrEx>
+          <w:tblCellMar>
+            <w:top w:w="0" w:type="dxa"/>
+            <w:bottom w:w="0" w:type="dxa"/>
+          </w:tblCellMar>
+        </w:tblPrEx>
+        <w:tc>
+          <w:tcPr>
+            <w:tcW w:w="3500" w:type="dxa"/>
+            <w:tcMar>
+              <w:top w:w="60" w:type="dxa"/>
+              <w:left w:w="90" w:type="dxa"/>
+              <w:bottom w:w="60" w:type="dxa"/>
+              <w:right w:w="90" w:type="dxa"/>
+            </w:tcMar>
+          </w:tcPr>
+          <w:p>
+            <w:r>
+              <w:rPr>
+                <w:rFonts w:ascii="Courier New" w:eastAsia="Courier New" w:hAnsi="Courier New" w:cs="Courier New"/>
+                <w:sz w:val="24"/>
+                <w:szCs w:val="24"/>
+              </w:rPr>
+              <w:t>TOTAL VALUE OF ALL COMPONENTS</w:t>
+            </w:r>
+          </w:p>
+        </w:tc>
+        <w:tc>
+          <w:tcPr>
+            <w:tcW w:w="2500" w:type="dxa"/>
+            <w:tcMar>
+              <w:top w:w="60" w:type="dxa"/>
+              <w:left w:w="90" w:type="dxa"/>
+              <w:bottom w:w="60" w:type="dxa"/>
+              <w:right w:w="90" w:type="dxa"/>
+            </w:tcMar>
+          </w:tcPr>
+          <w:p/>
+        </w:tc>
+        <w:tc>
+          <w:tcPr>
+            <w:tcW w:w="900" w:type="dxa"/>
+            <w:tcMar>
+              <w:top w:w="60" w:type="dxa"/>
+              <w:left w:w="90" w:type="dxa"/>
+              <w:bottom w:w="60" w:type="dxa"/>
+              <w:right w:w="90" w:type="dxa"/>
+            </w:tcMar>
+          </w:tcPr>
+          <w:p>
+            <w:pPr>
+              <w:jc w:val="center"/>
+            </w:pPr>
+          </w:p>
+        </w:tc>
+        <w:tc>
+          <w:tcPr>
+            <w:tcW w:w="2127" w:type="dxa"/>
+            <w:tcMar>
+              <w:top w:w="60" w:type="dxa"/>
+              <w:left w:w="90" w:type="dxa"/>
+              <w:bottom w:w="60" w:type="dxa"/>
+              <w:right w:w="90" w:type="dxa"/>
+            </w:tcMar>
+          </w:tcPr>
+          <w:p>
+            <w:pPr>
+              <w:jc w:val="right"/>
+            </w:pPr>
+            <w:r>
+              <w:rPr>
+                <w:rFonts w:ascii="Courier New" w:eastAsia="Courier New" w:hAnsi="Courier New" w:cs="Courier New"/>
+                <w:sz w:val="24"/>
+                <w:szCs w:val="24"/>
+              </w:rPr>
+              <w:t>1,195.00 - 1,955.00</w:t>
             </w:r>
           </w:p>
         </w:tc>
@@ -3117,7 +3151,7 @@
           <w:sz w:val="24"/>
           <w:szCs w:val="24"/>
         </w:rPr>
-        <w:t>The total additional cost of approximately PHP 210.00 to PHP 440.00 is well below the cost of a commercial door-alarm or access-control unit, supporting the claim that the design is affordable enough to be reproduced by students and small institutions.</w:t>
+        <w:t>The components used in the build are worth approximately PHP 1,195.00 to PHP 1,955.00 in total, but because the learning kit was already available, the additional cost to this study was only about PHP 150.00 to PHP 300.00. Even the full value of all components is well below the cost of a commercial door-alarm or access-control unit, supporting the claim that the design is affordable enough to be reproduced by students and small institutions.</w:t>
       </w:r>
     </w:p>
     <w:p>
@@ -3166,7 +3200,7 @@
           <w:sz w:val="24"/>
           <w:szCs w:val="24"/>
         </w:rPr>
-        <w:t>Control data consist of measurements taken at the same model doorway operating manually, with sensing and alarm disabled, in which entry is unrestricted and no record of an approach is produced. Experimental data are collected with SmartDoor active, as volunteer participants approach the model from marked distances and present the registered keyfob, the unregistered card, or no credential at all. Detection and control performance are measured through the ultrasonic sensor, the passive infrared sensor, the limit switch, and the display, with independent timing taken by stopwatch. Because the system combines distance sensing, infrared motion sensing, and credential verification, the detection success rate, the response and alarm times, the counts of false positives and false negatives, and the proportions of authorized entries granted and unauthorized attempts denied together serve as indicators of the security performance of the prototype.</w:t>
+        <w:t>Control data consist of measurements taken at the same model doorway operating manually, with sensing and alarm disabled, in which entry is unrestricted and no record of an approach is produced. Experimental data are collected with SmartDoor active, as volunteer participants approach the model from marked distances and present the registered keyfob, the unregistered card, or no credential at all. Detection and control performance are measured through the ultrasonic sensor, the passive infrared sensor, the tilt switch, and the display, with independent timing taken by stopwatch. Because the system combines distance sensing, infrared motion sensing, and credential verification, the detection success rate, the response and alarm times, the counts of false positives and false negatives, and the proportions of authorized entries granted and unauthorized attempts denied together serve as indicators of the security performance of the prototype.</w:t>
       </w:r>
     </w:p>
     <w:p>
@@ -4264,7 +4298,7 @@
                 <w:sz w:val="24"/>
                 <w:szCs w:val="24"/>
               </w:rPr>
-              <w:t>Runtime on one 9 V battery and one 4 x AA pack</w:t>
+              <w:t>Runtime on one 9 V battery</w:t>
             </w:r>
           </w:p>
         </w:tc>
@@ -4318,7 +4352,7 @@
           <w:sz w:val="24"/>
           <w:szCs w:val="24"/>
         </w:rPr>
-        <w:t xml:space="preserve"> The researchers gather all materials and program the Arduino Uno R3 with the access-control logic, which reads the ultrasonic and infrared sensors, checks the code of any presented tag against the registered credential, and drives the servo, display, buzzer, and indicator lights. They then calibrate each sensor before any trial. The ultrasonic sensor is checked against a tape measure at marked distances of 50, 100, 150, and 200 cm, and its reported values compared with the true distances. The passive infrared sensor has its sensitivity and time-delay potentiometers adjusted until it registers a walking person at the intended range without responding to an empty corridor. The servo travel limits are set so that the model door opens fully and closes flush without straining the motor, and the limit switch is positioned on the frame until it reliably distinguishes the closed position from an opening of a few centimetres. The keyfob supplied with the reader is registered in the program as the authorized credential and the white card is deliberately left unregistered, so that the two tags represent an authorized and an unauthorized user during testing.</w:t>
+        <w:t xml:space="preserve"> The researchers gather all materials and program the Arduino Uno R3 with the access-control logic, which reads the ultrasonic and infrared sensors, checks the code of any presented tag against the registered credential, and drives the servo, display, buzzer, and indicator lights. They then calibrate each sensor before any trial. The ultrasonic sensor is checked against a tape measure at marked distances of 50, 100, 150, and 200 cm, and its reported values compared with the true distances. The passive infrared sensor has its sensitivity and time-delay potentiometers adjusted until it registers a walking person at the intended range without responding to an empty corridor. The servo travel limits are set so that the model door opens fully and closes flush without straining the motor, and the tilt switch is positioned on the panel until it reliably distinguishes the closed position from an opening of a few centimetres. The keyfob supplied with the reader is registered in the program as the authorized credential and the white card is deliberately left unregistered, so that the two tags represent an authorized and an unauthorized user during testing.</w:t>
       </w:r>
     </w:p>
     <w:p>
@@ -4347,7 +4381,7 @@
           <w:sz w:val="24"/>
           <w:szCs w:val="24"/>
         </w:rPr>
-        <w:t xml:space="preserve"> The researchers cut and assemble the mini door panel and frame from foam board, joining the panel to the frame with miniature hinges so that it swings freely. The ultrasonic and infrared sensors are mounted on the frame facing the approach path, and the RFID reader is mounted on the approach side within easy reach. The servo is fixed to the frame and linked to the panel by a short lever arm, and the limit switch is mounted on the frame at the closing edge of the doorway. The Arduino, breadboard, display, buzzer, indicator lights, switch, and 9 V battery are mounted on a base beside the frame rather than on the door panel, so that the weight of the electronics does not load the micro servo and the small panel can swing freely. The servo is wired to its own four-cell battery pack, the negative terminal of which is joined to the ground of the Arduino so that the two supplies share a common reference and the control signal is interpreted correctly. Because the reader, the display, the two sensors, the servo, the buzzer, the two indicators, and the two switches together require fourteen signal connections while pins 0 and 1 are reserved for the USB serial link, the analogue pins A0 to A3 are used as additional digital inputs and outputs. All connections are made with jumper and female-to-male cables, wiring is secured so that no cable can be caught by the moving panel, and the completed system is powered on and observed through a full open-and-close cycle before any participant trial begins.</w:t>
+        <w:t xml:space="preserve"> The researchers cut and assemble the mini door panel and frame from foam board, joining the panel to the frame with miniature hinges so that it swings freely. The ultrasonic and infrared sensors are mounted on the frame facing the approach path, and the RFID reader is mounted on the approach side within easy reach. The servo is fixed to the frame and linked to the panel by a short lever arm, and the tilt switch is attached to the panel itself. The Arduino, breadboard, display, buzzer, indicator lights, switch, and 9 V battery are mounted on a base beside the frame rather than on the door panel, so that the weight of the electronics does not load the micro servo and the small panel can swing freely. All connections are made with jumper and female-to-male cables, wiring is secured so that no cable can be caught by the moving panel, and the completed system is powered on and observed through a full open-and-close cycle before any participant trial begins.</w:t>
       </w:r>
     </w:p>
     <w:p>
@@ -4376,7 +4410,7 @@
           <w:sz w:val="24"/>
           <w:szCs w:val="24"/>
         </w:rPr>
-        <w:t xml:space="preserve"> The researchers record the condition of the model doorway before automation. With sensing and alarm disabled, volunteer participants approach and open the model door while the researchers record whether any detection, indication, or alarm is produced, and whether anyone not standing at the door would become aware of the entry. The number of entries completed without restriction is counted, the manual opening and closing times are taken by stopwatch, and it is noted that the unautomated doorway draws no current at all, which is the figure against which the standby and operating currents of the automated system are compared. </w:t>
+        <w:t xml:space="preserve"> The researchers record the condition of the model doorway before automation. With sensing and alarm disabled, volunteer participants approach and open the model door while the researchers record whether any detection, indication, or alarm is produced, and whether anyone not standing at the door would become aware of the entry. The number of entries completed without restriction is counted, the manual opening and closing times are taken by stopwatch, and the current drawn by the unpowered installation is noted. </w:t>
         <w:lastRenderedPageBreak/>
         <w:t>These baseline values establish the unmonitored condition against which the automated system is compared.</w:t>
       </w:r>
@@ -4407,7 +4441,7 @@
           <w:sz w:val="24"/>
           <w:szCs w:val="24"/>
         </w:rPr>
-        <w:t xml:space="preserve"> The researchers activate SmartDoor and conduct the trials. In the detection trials, a participant walks toward the model from each marked distance while the researchers record the distance at which detection occurs, whether the detection is correct, and the time between detection and the response of the system. In the authorized-entry trials, the participant presents the registered keyfob, and the researchers record whether the green indicator lights, whether the servo opens the panel, how long it remains open, and whether the limit switch confirms the movement. In the unauthorized-attempt trials, the participant presents the unregistered white card or presents no credential at all, and the researchers record whether entry is refused, whether the red indicator and buzzer activate, and how long the alarm takes to sound. A further set of trials is run with no person present and with a non-human object placed before the sensors, to count false positives, and with a participant standing still within range, to count false negatives. Current draw is measured with the multimeter in standby and during door movement, and the prototype is left running on the 9 V battery to determine continuous operating time. Every condition is repeated for three to five trials, and all readings are entered on the recording sheet as they are taken.</w:t>
+        <w:t xml:space="preserve"> The researchers activate SmartDoor and conduct the trials. In the detection trials, a participant walks toward the model from each marked distance while the researchers record the distance at which detection occurs, whether the detection is correct, and the time between detection and the response of the system. In the authorized-entry trials, the participant presents the registered keyfob, and the researchers record whether the green indicator lights, whether the servo opens the panel, how long it remains open, and whether the tilt switch confirms the movement. In the unauthorized-attempt trials, the participant presents the unregistered white card or presents no credential at all, and the researchers record whether entry is refused, whether the red indicator and buzzer activate, and how long the alarm takes to sound. A further set of trials is run with no person present and with a non-human object placed before the sensors, to count false positives, and with a participant standing still within range, to count false negatives. Current draw is measured with the multimeter in standby and during door movement, and the prototype is left running on the 9 V battery to determine continuous operating time. Every condition is repeated for three to five trials, and all readings are entered on the recording sheet as they are taken.</w:t>
       </w:r>
     </w:p>
     <w:p>

</xml_diff>